<commit_message>
New Zealand script: the removed requirement stated first, then the fees
Co-Authored-By: Claude Fable 5.1 <noreply@anthropic.com>
Claude-Session: https://claude.ai/code/session_01REVwghctKjYh8VQ919ThdA
</commit_message>
<xml_diff>
--- a/policies/interviews/Interview_script_New_Zealand.docx
+++ b/policies/interviews/Interview_script_New_Zealand.docx
@@ -115,7 +115,7 @@
           <w:sz w:val="24"/>
           <w:szCs w:val="24"/>
         </w:rPr>
-        <w:t xml:space="preserve"> the Ministry of Education (education workforce) and the Teaching Council, which issues practising certificates.</w:t>
+        <w:t xml:space="preserve"> someone in the Ministry of Education (education workforce), or at the Teaching Council, which issues practising certificates.</w:t>
       </w:r>
     </w:p>
     <w:p>
@@ -142,7 +142,7 @@
           <w:sz w:val="24"/>
           <w:szCs w:val="24"/>
         </w:rPr>
-        <w:t xml:space="preserve"> Registered teachers who had not taught for five years or more used to need a refresher course before getting a practising certificate back, and that requirement has gone. With a job offer in hand, a returner now renews the certificate directly, can do substitute teaching for up to twenty half-days while the renewal is processed, and agrees a short teaching plan with the school principal in place of the course. The government also pays the registration fees, so coming back costs the teacher nothing. Fees have been covered since October 2024 and are funded until June 2028; 352 teachers had returned by April</w:t>
+        <w:t xml:space="preserve"> The government removed the requirement that a registered teacher who had been out of the classroom for five years or more complete a refresher course in order to renew the practising certificate issued by the Teaching Council. The course is no longer compulsory: a returner with a job offer renews the certificate directly, agreeing a short teaching plan with the school principal instead, and can already work as a substitute for up to twenty half-days while the renewal is processed. Since October 2024 the government also pays the registration fees, so coming back costs nothing; the funding runs until June 2028. By April 2025, 352 teachers had returned. What we do not know is how many of them would have returned anyway and whether they stayed, whether the measure has been evaluated, and why the course was dropped rather than shortened or made free.</w:t>
       </w:r>
     </w:p>
     <w:p>
@@ -159,7 +159,18 @@
           <w:sz w:val="24"/>
           <w:szCs w:val="24"/>
         </w:rPr>
-        <w:t xml:space="preserve">2025.	</w:t>
+        <w:t xml:space="preserve">1.	</w:t>
+      </w:r>
+      <w:r>
+        <w:rPr>
+          <w:rFonts w:ascii="Garamond" w:cs="Garamond" w:eastAsia="Garamond" w:hAnsi="Garamond"/>
+          <w:b/>
+          <w:bCs/>
+          <w:color w:val="000000"/>
+          <w:sz w:val="24"/>
+          <w:szCs w:val="24"/>
+        </w:rPr>
+        <w:t xml:space="preserve">In what context did the government decide to remove the refresher course and cover the fees, and with what purpose?</w:t>
       </w:r>
       <w:r>
         <w:rPr>
@@ -170,7 +181,7 @@
           <w:sz w:val="24"/>
           <w:szCs w:val="24"/>
         </w:rPr>
-        <w:t xml:space="preserve">What we do not know is how many of those would have returned anyway, and whether they stayed.</w:t>
+        <w:t xml:space="preserve"> Did New Zealand face strong teacher shortages at that moment?</w:t>
       </w:r>
     </w:p>
     <w:p>
@@ -187,45 +198,6 @@
           <w:sz w:val="24"/>
           <w:szCs w:val="24"/>
         </w:rPr>
-        <w:t xml:space="preserve">1.	</w:t>
-      </w:r>
-      <w:r>
-        <w:rPr>
-          <w:rFonts w:ascii="Garamond" w:cs="Garamond" w:eastAsia="Garamond" w:hAnsi="Garamond"/>
-          <w:b/>
-          <w:bCs/>
-          <w:color w:val="000000"/>
-          <w:sz w:val="24"/>
-          <w:szCs w:val="24"/>
-        </w:rPr>
-        <w:t xml:space="preserve">In what context did the government decide to remove the refresher course and cover the fees, and with what purpose?</w:t>
-      </w:r>
-      <w:r>
-        <w:rPr>
-          <w:rFonts w:ascii="Garamond" w:cs="Garamond" w:eastAsia="Garamond" w:hAnsi="Garamond"/>
-          <w:b w:val="false"/>
-          <w:bCs w:val="false"/>
-          <w:color w:val="000000"/>
-          <w:sz w:val="24"/>
-          <w:szCs w:val="24"/>
-        </w:rPr>
-        <w:t xml:space="preserve"> Was the teacher shortage severe at that moment?</w:t>
-      </w:r>
-    </w:p>
-    <w:p>
-      <w:pPr>
-        <w:spacing w:after="60" w:before="200"/>
-        <w:ind w:left="504" w:hanging="504"/>
-      </w:pPr>
-      <w:r>
-        <w:rPr>
-          <w:rFonts w:ascii="Garamond" w:cs="Garamond" w:eastAsia="Garamond" w:hAnsi="Garamond"/>
-          <w:b/>
-          <w:bCs/>
-          <w:color w:val="000000"/>
-          <w:sz w:val="24"/>
-          <w:szCs w:val="24"/>
-        </w:rPr>
         <w:t xml:space="preserve">2.	</w:t>
       </w:r>
       <w:r>
@@ -237,7 +209,7 @@
           <w:sz w:val="24"/>
           <w:szCs w:val="24"/>
         </w:rPr>
-        <w:t xml:space="preserve">Why was the refresher course dropped rather than shortened or made free? Was there a concern about teachers coming back after many years without any preparation, and how was it answered?</w:t>
+        <w:t xml:space="preserve">We understand the refresher course was dropped rather than shortened or made free. Why that choice, and how was the concern about teachers returning after many years without preparation answered?</w:t>
       </w:r>
     </w:p>
     <w:p>
@@ -330,7 +302,7 @@
           <w:sz w:val="24"/>
           <w:szCs w:val="24"/>
         </w:rPr>
-        <w:t xml:space="preserve">Can you describe the profile of the 352 teachers who had returned by April 2025: how long they had been away, what they had been doing, and where they went?</w:t>
+        <w:t xml:space="preserve">Can you describe the profile of the teachers who have returned: how long they had been away, what they had been doing, and where they went?</w:t>
       </w:r>
     </w:p>
     <w:p>
@@ -358,7 +330,7 @@
           <w:sz w:val="24"/>
           <w:szCs w:val="24"/>
         </w:rPr>
-        <w:t xml:space="preserve">Is there any record of how well the measure has worked: figures after April 2025, whether the returners stayed, an evaluation?</w:t>
+        <w:t xml:space="preserve">Is there any record of how well the measure has worked: figures after April 2025, whether the returners stayed, an internal evaluation?</w:t>
       </w:r>
     </w:p>
     <w:p>
@@ -384,7 +356,7 @@
           <w:sz w:val="21"/>
           <w:szCs w:val="21"/>
         </w:rPr>
-        <w:t xml:space="preserve">Is there any sign of what happens in the classroom to teachers who came back without the course?</w:t>
+        <w:t xml:space="preserve">Is there any sign of how teachers who came back without the course are doing in the classroom?</w:t>
       </w:r>
     </w:p>
     <w:p>
@@ -412,7 +384,7 @@
           <w:sz w:val="24"/>
           <w:szCs w:val="24"/>
         </w:rPr>
-        <w:t xml:space="preserve">Overall, what is your assessment of the measure, and what will decide whether the fees are still covered after June 2028?</w:t>
+        <w:t xml:space="preserve">Do you know about any other policy, in New Zealand or elsewhere, that aims to re-attract former teachers?</w:t>
       </w:r>
     </w:p>
     <w:p>
@@ -430,6 +402,34 @@
           <w:szCs w:val="24"/>
         </w:rPr>
         <w:t xml:space="preserve">7.	</w:t>
+      </w:r>
+      <w:r>
+        <w:rPr>
+          <w:rFonts w:ascii="Garamond" w:cs="Garamond" w:eastAsia="Garamond" w:hAnsi="Garamond"/>
+          <w:b/>
+          <w:bCs/>
+          <w:color w:val="000000"/>
+          <w:sz w:val="24"/>
+          <w:szCs w:val="24"/>
+        </w:rPr>
+        <w:t xml:space="preserve">Overall, what is your assessment of the measure, and what will decide whether the fees are still covered after June 2028?</w:t>
+      </w:r>
+    </w:p>
+    <w:p>
+      <w:pPr>
+        <w:spacing w:after="60" w:before="200"/>
+        <w:ind w:left="504" w:hanging="504"/>
+      </w:pPr>
+      <w:r>
+        <w:rPr>
+          <w:rFonts w:ascii="Garamond" w:cs="Garamond" w:eastAsia="Garamond" w:hAnsi="Garamond"/>
+          <w:b/>
+          <w:bCs/>
+          <w:color w:val="000000"/>
+          <w:sz w:val="24"/>
+          <w:szCs w:val="24"/>
+        </w:rPr>
+        <w:t xml:space="preserve">8.	</w:t>
       </w:r>
       <w:r>
         <w:rPr>

</xml_diff>